<commit_message>
V1.22.6 - expanded UI timeout
</commit_message>
<xml_diff>
--- a/Acme_Corp_Cybersecurity_Maturity_Report.docx
+++ b/Acme_Corp_Cybersecurity_Maturity_Report.docx
@@ -933,27 +933,6 @@
         <w:br w:type="page"/>
       </w:r>
     </w:p>
-    <w:p>
-      <w:pPr>
-        <w:pStyle w:val="Heading1"/>
-        <w:spacing w:before="0" w:after="240"/>
-        <w:jc w:val="center"/>
-        <w:rPr>
-          <w:b/>
-          <w:bCs/>
-          <w:color w:val="EE0000"/>
-        </w:rPr>
-      </w:pPr>
-      <w:r>
-        <w:rPr>
-          <w:b/>
-          <w:bCs/>
-          <w:color w:val="EE0000"/>
-        </w:rPr>
-        <w:lastRenderedPageBreak/>
-        <w:t>INSERT CUSTOMER LOGO</w:t>
-      </w:r>
-    </w:p>
     <w:p/>
     <w:p>
       <w:pPr>
@@ -1235,11 +1214,7 @@
       </w:r>
       <w:r>
         <w:br/>
-        <w:t xml:space="preserve">The strategic roadmap for Acme Corp must begin with foundational hygiene improvements, such as enforcing MFA universally, automating patch management, and implementing a robust backup solution. This will stabilise the environment and align with Cyber Essentials compliance. The next phase should introduce active managed defence capabilities like Adlumin MDR to provide 24/7 threat detection and response, complemented by security awareness training to address human risk factors. Finally, the roadmap should culminate in adaptive governance measures, including the adoption of Zero Trust Architecture and automated disaster recovery, ensuring resilience against </w:t>
-      </w:r>
-      <w:r>
-        <w:lastRenderedPageBreak/>
-        <w:t>evolving threats. These efforts will not only reduce risk but also position Acme Corp as a security-conscious organisation capable of maintaining regulatory compliance and protecting its critical assets.</w:t>
+        <w:t>The strategic roadmap for Acme Corp must begin with foundational hygiene improvements, such as enforcing MFA universally, automating patch management, and implementing a robust backup solution. This will stabilise the environment and align with Cyber Essentials compliance. The next phase should introduce active managed defence capabilities like Adlumin MDR to provide 24/7 threat detection and response, complemented by security awareness training to address human risk factors. Finally, the roadmap should culminate in adaptive governance measures, including the adoption of Zero Trust Architecture and automated disaster recovery, ensuring resilience against evolving threats. These efforts will not only reduce risk but also position Acme Corp as a security-conscious organisation capable of maintaining regulatory compliance and protecting its critical assets.</w:t>
       </w:r>
     </w:p>
     <w:p/>
@@ -1584,7 +1559,6 @@
         <w:rPr>
           <w:rStyle w:val="Heading2Char"/>
         </w:rPr>
-        <w:lastRenderedPageBreak/>
         <w:t>Compliance and Framework Alignment</w:t>
       </w:r>
     </w:p>
@@ -1620,6 +1594,7 @@
           <w:b/>
           <w:bCs/>
         </w:rPr>
+        <w:lastRenderedPageBreak/>
         <w:t>- Gap:</w:t>
       </w:r>
       <w:r>
@@ -1981,11 +1956,11 @@
     <w:p/>
     <w:p>
       <w:r>
-        <w:t xml:space="preserve">The technology sector, particularly those handling sensitive data like patient records, is a prime target for ransomware groups and Advanced Persistent Threat (APT) actors. Groups such as Conti and </w:t>
+        <w:t xml:space="preserve">The technology sector, particularly those handling sensitive data like patient records, is a prime target for ransomware groups and Advanced Persistent Threat (APT) actors. Groups such as Conti and LockBit have a history of targeting organisations with high-value data, leveraging phishing campaigns and exploiting unpatched vulnerabilities to gain access. The reliance on legacy VPNs and limited MFA enforcement makes Acme Corp particularly susceptible to credential theft and lateral movement </w:t>
       </w:r>
       <w:r>
         <w:lastRenderedPageBreak/>
-        <w:t>LockBit have a history of targeting organisations with high-value data, leveraging phishing campaigns and exploiting unpatched vulnerabilities to gain access. The reliance on legacy VPNs and limited MFA enforcement makes Acme Corp particularly susceptible to credential theft and lateral movement within the network. Additionally, the absence of SaaS backups heightens the risk of irrecoverable data loss in ransomware scenarios. These factors underscore the urgency of implementing robust access controls, automated patching, and comprehensive threat detection capabilities.</w:t>
+        <w:t>within the network. Additionally, the absence of SaaS backups heightens the risk of irrecoverable data loss in ransomware scenarios. These factors underscore the urgency of implementing robust access controls, automated patching, and comprehensive threat detection capabilities.</w:t>
       </w:r>
     </w:p>
     <w:p>
@@ -12355,37 +12330,7 @@
           <w:sz w:val="20"/>
           <w:szCs w:val="24"/>
         </w:rPr>
-        <w:t xml:space="preserve">e are highly experienced in planning and installing entire new IT systems in large </w:t>
-      </w:r>
-      <w:commentRangeStart w:id="3"/>
-      <w:r>
-        <w:rPr>
-          <w:rFonts w:ascii="Roboto" w:eastAsiaTheme="minorHAnsi" w:hAnsi="Roboto" w:cstheme="minorBidi"/>
-          <w:color w:val="auto"/>
-          <w:sz w:val="20"/>
-          <w:szCs w:val="24"/>
-        </w:rPr>
-        <w:t>organisations</w:t>
-      </w:r>
-      <w:commentRangeEnd w:id="3"/>
-      <w:r>
-        <w:rPr>
-          <w:rStyle w:val="CommentReference"/>
-          <w:rFonts w:ascii="Roboto" w:eastAsiaTheme="minorHAnsi" w:hAnsi="Roboto" w:cstheme="minorBidi"/>
-          <w:color w:val="auto"/>
-          <w:sz w:val="20"/>
-          <w:szCs w:val="24"/>
-        </w:rPr>
-        <w:commentReference w:id="3"/>
-      </w:r>
-      <w:r>
-        <w:rPr>
-          <w:rFonts w:ascii="Roboto" w:eastAsiaTheme="minorHAnsi" w:hAnsi="Roboto" w:cstheme="minorBidi"/>
-          <w:color w:val="auto"/>
-          <w:sz w:val="20"/>
-          <w:szCs w:val="24"/>
-        </w:rPr>
-        <w:t>.</w:t>
+        <w:t>e are highly experienced in planning and installing entire new IT systems in large organisations.</w:t>
       </w:r>
     </w:p>
     <w:p>
@@ -12430,7 +12375,7 @@
                     <pic:cNvPicPr/>
                   </pic:nvPicPr>
                   <pic:blipFill>
-                    <a:blip r:embed="rId37">
+                    <a:blip r:embed="rId33">
                       <a:extLst>
                         <a:ext uri="{28A0092B-C50C-407E-A947-70E740481C1C}">
                           <a14:useLocalDpi xmlns:a14="http://schemas.microsoft.com/office/drawing/2010/main" val="0"/>
@@ -12696,7 +12641,7 @@
                           </pic:cNvPicPr>
                         </pic:nvPicPr>
                         <pic:blipFill>
-                          <a:blip r:embed="rId38">
+                          <a:blip r:embed="rId34">
                             <a:extLst>
                               <a:ext uri="{28A0092B-C50C-407E-A947-70E740481C1C}">
                                 <a14:useLocalDpi xmlns:a14="http://schemas.microsoft.com/office/drawing/2010/main" val="0"/>
@@ -12736,7 +12681,7 @@
                           </pic:cNvPicPr>
                         </pic:nvPicPr>
                         <pic:blipFill>
-                          <a:blip r:embed="rId39" cstate="print">
+                          <a:blip r:embed="rId35" cstate="print">
                             <a:extLst>
                               <a:ext uri="{28A0092B-C50C-407E-A947-70E740481C1C}">
                                 <a14:useLocalDpi xmlns:a14="http://schemas.microsoft.com/office/drawing/2010/main" val="0"/>
@@ -12771,7 +12716,7 @@
                           </pic:cNvPicPr>
                         </pic:nvPicPr>
                         <pic:blipFill>
-                          <a:blip r:embed="rId40">
+                          <a:blip r:embed="rId36">
                             <a:clrChange>
                               <a:clrFrom>
                                 <a:srgbClr val="FFFFFF"/>
@@ -12834,33 +12779,7 @@
         <w:t>client relationship</w:t>
       </w:r>
       <w:r>
-        <w:t xml:space="preserve">s. Here's a snapshot of some of the customers we work with </w:t>
-      </w:r>
-      <w:commentRangeStart w:id="5"/>
-      <w:commentRangeStart w:id="6"/>
-      <w:r>
-        <w:t>today</w:t>
-      </w:r>
-      <w:commentRangeEnd w:id="5"/>
-      <w:r>
-        <w:rPr>
-          <w:rStyle w:val="CommentReference"/>
-          <w:sz w:val="20"/>
-          <w:szCs w:val="24"/>
-        </w:rPr>
-        <w:commentReference w:id="5"/>
-      </w:r>
-      <w:commentRangeEnd w:id="6"/>
-      <w:r>
-        <w:rPr>
-          <w:rStyle w:val="CommentReference"/>
-          <w:sz w:val="20"/>
-          <w:szCs w:val="24"/>
-        </w:rPr>
-        <w:commentReference w:id="6"/>
-      </w:r>
-      <w:r>
-        <w:t>.</w:t>
+        <w:t>s. Here's a snapshot of some of the customers we work with today.</w:t>
       </w:r>
     </w:p>
     <w:p>
@@ -12887,9 +12806,9 @@
           <w:rFonts w:eastAsia="Times New Roman"/>
         </w:rPr>
       </w:pPr>
-      <w:bookmarkStart w:id="9" w:name="_Toc530486053"/>
-      <w:bookmarkStart w:id="10" w:name="_Toc530486045"/>
-      <w:bookmarkStart w:id="11" w:name="_Toc530486060"/>
+      <w:bookmarkStart w:id="3" w:name="_Toc530486053"/>
+      <w:bookmarkStart w:id="4" w:name="_Toc530486045"/>
+      <w:bookmarkStart w:id="5" w:name="_Toc530486060"/>
       <w:bookmarkEnd w:id="2"/>
       <w:r>
         <w:rPr>
@@ -16349,9 +16268,9 @@
       <w:r>
         <w:br w:type="page"/>
       </w:r>
-      <w:bookmarkStart w:id="12" w:name="_Toc534620788"/>
+      <w:bookmarkStart w:id="6" w:name="_Toc534620788"/>
     </w:p>
-    <w:bookmarkEnd w:id="12"/>
+    <w:bookmarkEnd w:id="6"/>
     <w:p>
       <w:pPr>
         <w:pStyle w:val="Heading1"/>
@@ -18220,13 +18139,13 @@
           <w:szCs w:val="32"/>
         </w:rPr>
       </w:pPr>
-      <w:bookmarkStart w:id="13" w:name="_Toc530485984"/>
-      <w:bookmarkStart w:id="14" w:name="_Toc530486036"/>
-      <w:bookmarkEnd w:id="9"/>
-      <w:bookmarkEnd w:id="10"/>
+      <w:bookmarkStart w:id="7" w:name="_Toc530485984"/>
+      <w:bookmarkStart w:id="8" w:name="_Toc530486036"/>
+      <w:bookmarkEnd w:id="3"/>
+      <w:bookmarkEnd w:id="4"/>
     </w:p>
-    <w:bookmarkEnd w:id="13"/>
-    <w:bookmarkEnd w:id="14"/>
+    <w:bookmarkEnd w:id="7"/>
+    <w:bookmarkEnd w:id="8"/>
     <w:p/>
     <w:p/>
     <w:p/>
@@ -18932,7 +18851,7 @@
     <w:p/>
     <w:p/>
     <w:p/>
-    <w:bookmarkEnd w:id="11"/>
+    <w:bookmarkEnd w:id="5"/>
     <w:p/>
     <w:sectPr>
       <w:headerReference w:type="default" r:id="rId54"/>
@@ -18945,166 +18864,6 @@
     </w:sectPr>
   </w:body>
 </w:document>
-</file>
-
-<file path=word/comments.xml><?xml version="1.0" encoding="utf-8"?>
-<w:comments xmlns:wpc="http://schemas.microsoft.com/office/word/2010/wordprocessingCanvas" xmlns:cx="http://schemas.microsoft.com/office/drawing/2014/chartex" xmlns:cx1="http://schemas.microsoft.com/office/drawing/2015/9/8/chartex" xmlns:cx2="http://schemas.microsoft.com/office/drawing/2015/10/21/chartex" xmlns:cx3="http://schemas.microsoft.com/office/drawing/2016/5/9/chartex" xmlns:cx4="http://schemas.microsoft.com/office/drawing/2016/5/10/chartex" xmlns:cx5="http://schemas.microsoft.com/office/drawing/2016/5/11/chartex" xmlns:cx6="http://schemas.microsoft.com/office/drawing/2016/5/12/chartex" xmlns:cx7="http://schemas.microsoft.com/office/drawing/2016/5/13/chartex" xmlns:cx8="http://schemas.microsoft.com/office/drawing/2016/5/14/chartex" xmlns:mc="http://schemas.openxmlformats.org/markup-compatibility/2006" xmlns:m="http://schemas.openxmlformats.org/officeDocument/2006/math" xmlns:aink="http://schemas.microsoft.com/office/drawing/2016/ink" xmlns:am3d="http://schemas.microsoft.com/office/drawing/2017/model3d" xmlns:oel="http://schemas.microsoft.com/office/2019/extlst" xmlns:r="http://schemas.openxmlformats.org/officeDocument/2006/relationships" xmlns:wp14="http://schemas.microsoft.com/office/word/2010/wordprocessingDrawing" xmlns:wp="http://schemas.openxmlformats.org/drawingml/2006/wordprocessingDrawing" xmlns:wpg="http://schemas.microsoft.com/office/word/2010/wordprocessingGroup" xmlns:wpi="http://schemas.microsoft.com/office/word/2010/wordprocessingInk" xmlns:wps="http://schemas.microsoft.com/office/word/2010/wordprocessingShape" xmlns:o="urn:schemas-microsoft-com:office:office" xmlns:v="urn:schemas-microsoft-com:vml" xmlns:w10="urn:schemas-microsoft-com:office:word" xmlns:w="http://schemas.openxmlformats.org/wordprocessingml/2006/main" xmlns:w14="http://schemas.microsoft.com/office/word/2010/wordml" xmlns:w15="http://schemas.microsoft.com/office/word/2012/wordml" xmlns:w16cex="http://schemas.microsoft.com/office/word/2018/wordml/cex" xmlns:w16cid="http://schemas.microsoft.com/office/word/2016/wordml/cid" xmlns:w16="http://schemas.microsoft.com/office/word/2018/wordml" xmlns:w16sdtdh="http://schemas.microsoft.com/office/word/2020/wordml/sdtdatahash" xmlns:w16sdtfl="http://schemas.microsoft.com/office/word/2024/wordml/sdtformatlock" xmlns:w16se="http://schemas.microsoft.com/office/word/2015/wordml/symex" xmlns:w16du="http://schemas.microsoft.com/office/word/2023/wordml/word16du" xmlns:wne="http://schemas.microsoft.com/office/word/2006/wordml" mc:Ignorable="w14 w15 w16se w16cid w16 w16cex w16sdtdh w16sdtfl w16du wp14">
-  <w:comment w:id="3" w:author="James Dell" w:date="2025-03-31T14:25:00Z" w:initials="JD">
-    <w:p>
-      <w:r>
-        <w:rPr>
-          <w:rStyle w:val="CommentReference"/>
-        </w:rPr>
-        <w:annotationRef/>
-      </w:r>
-      <w:r>
-        <w:rPr>
-          <w:szCs w:val="20"/>
-        </w:rPr>
-        <w:fldChar w:fldCharType="begin"/>
-      </w:r>
-      <w:r>
-        <w:rPr>
-          <w:szCs w:val="20"/>
-        </w:rPr>
-        <w:instrText>HYPERLINK "mailto:Barry.OBrien@planet-it.net"</w:instrText>
-      </w:r>
-      <w:r>
-        <w:rPr>
-          <w:szCs w:val="20"/>
-        </w:rPr>
-      </w:r>
-      <w:bookmarkStart w:id="4" w:name="_@_1AC465CF0D31D54887012D1C6E2FF561Z"/>
-      <w:r>
-        <w:rPr>
-          <w:szCs w:val="20"/>
-        </w:rPr>
-        <w:fldChar w:fldCharType="separate"/>
-      </w:r>
-      <w:bookmarkEnd w:id="4"/>
-      <w:r>
-        <w:rPr>
-          <w:rStyle w:val="Mention"/>
-          <w:noProof/>
-          <w:szCs w:val="20"/>
-        </w:rPr>
-        <w:t>@Barry O'Brien</w:t>
-      </w:r>
-      <w:r>
-        <w:rPr>
-          <w:szCs w:val="20"/>
-        </w:rPr>
-        <w:fldChar w:fldCharType="end"/>
-      </w:r>
-      <w:r>
-        <w:rPr>
-          <w:szCs w:val="20"/>
-        </w:rPr>
-        <w:t xml:space="preserve"> do we have one of these with updated vendor logos?</w:t>
-      </w:r>
-    </w:p>
-    <w:p/>
-  </w:comment>
-  <w:comment w:id="5" w:author="James Dell" w:date="2025-03-31T14:25:00Z" w:initials="JD">
-    <w:p>
-      <w:r>
-        <w:rPr>
-          <w:rStyle w:val="CommentReference"/>
-        </w:rPr>
-        <w:annotationRef/>
-      </w:r>
-      <w:r>
-        <w:rPr>
-          <w:szCs w:val="20"/>
-        </w:rPr>
-        <w:t xml:space="preserve">Do we want to change any of these </w:t>
-      </w:r>
-      <w:r>
-        <w:fldChar w:fldCharType="begin"/>
-      </w:r>
-      <w:r>
-        <w:instrText>HYPERLINK "mailto:Barry.OBrien@planet-it.net"</w:instrText>
-      </w:r>
-      <w:bookmarkStart w:id="7" w:name="_@_EF5D7F938E9B93478702AB2AFB51A3B8Z"/>
-      <w:r>
-        <w:fldChar w:fldCharType="separate"/>
-      </w:r>
-      <w:bookmarkEnd w:id="7"/>
-      <w:r>
-        <w:rPr>
-          <w:rStyle w:val="Mention"/>
-          <w:noProof/>
-        </w:rPr>
-        <w:t>@Barry O'Brien</w:t>
-      </w:r>
-      <w:r>
-        <w:fldChar w:fldCharType="end"/>
-      </w:r>
-    </w:p>
-  </w:comment>
-  <w:comment w:id="6" w:author="Barry O'Brien" w:date="2025-03-31T14:29:00Z" w:initials="BO">
-    <w:p>
-      <w:r>
-        <w:rPr>
-          <w:rStyle w:val="CommentReference"/>
-        </w:rPr>
-        <w:annotationRef/>
-      </w:r>
-      <w:r>
-        <w:rPr>
-          <w:color w:val="000000"/>
-          <w:szCs w:val="20"/>
-        </w:rPr>
-        <w:t xml:space="preserve">I just added a couple but not going to remove any </w:t>
-      </w:r>
-      <w:r>
-        <w:fldChar w:fldCharType="begin"/>
-      </w:r>
-      <w:r>
-        <w:instrText>HYPERLINK "mailto:James.Dell@planet-it.net"</w:instrText>
-      </w:r>
-      <w:bookmarkStart w:id="8" w:name="_@_D049DB355048BC4C922148307B14773EZ"/>
-      <w:r>
-        <w:fldChar w:fldCharType="separate"/>
-      </w:r>
-      <w:bookmarkEnd w:id="8"/>
-      <w:r>
-        <w:rPr>
-          <w:rStyle w:val="Mention"/>
-          <w:noProof/>
-        </w:rPr>
-        <w:t>@James Dell</w:t>
-      </w:r>
-      <w:r>
-        <w:fldChar w:fldCharType="end"/>
-      </w:r>
-    </w:p>
-  </w:comment>
-</w:comments>
-</file>
-
-<file path=word/commentsExtended.xml><?xml version="1.0" encoding="utf-8"?>
-<w15:commentsEx xmlns:wpc="http://schemas.microsoft.com/office/word/2010/wordprocessingCanvas" xmlns:cx="http://schemas.microsoft.com/office/drawing/2014/chartex" xmlns:cx1="http://schemas.microsoft.com/office/drawing/2015/9/8/chartex" xmlns:cx2="http://schemas.microsoft.com/office/drawing/2015/10/21/chartex" xmlns:cx3="http://schemas.microsoft.com/office/drawing/2016/5/9/chartex" xmlns:cx4="http://schemas.microsoft.com/office/drawing/2016/5/10/chartex" xmlns:cx5="http://schemas.microsoft.com/office/drawing/2016/5/11/chartex" xmlns:cx6="http://schemas.microsoft.com/office/drawing/2016/5/12/chartex" xmlns:cx7="http://schemas.microsoft.com/office/drawing/2016/5/13/chartex" xmlns:cx8="http://schemas.microsoft.com/office/drawing/2016/5/14/chartex" xmlns:mc="http://schemas.openxmlformats.org/markup-compatibility/2006" xmlns:m="http://schemas.openxmlformats.org/officeDocument/2006/math" xmlns:aink="http://schemas.microsoft.com/office/drawing/2016/ink" xmlns:am3d="http://schemas.microsoft.com/office/drawing/2017/model3d" xmlns:oel="http://schemas.microsoft.com/office/2019/extlst" xmlns:r="http://schemas.openxmlformats.org/officeDocument/2006/relationships" xmlns:wp14="http://schemas.microsoft.com/office/word/2010/wordprocessingDrawing" xmlns:wp="http://schemas.openxmlformats.org/drawingml/2006/wordprocessingDrawing" xmlns:wpg="http://schemas.microsoft.com/office/word/2010/wordprocessingGroup" xmlns:wpi="http://schemas.microsoft.com/office/word/2010/wordprocessingInk" xmlns:wps="http://schemas.microsoft.com/office/word/2010/wordprocessingShape" xmlns:o="urn:schemas-microsoft-com:office:office" xmlns:v="urn:schemas-microsoft-com:vml" xmlns:w10="urn:schemas-microsoft-com:office:word" xmlns:w="http://schemas.openxmlformats.org/wordprocessingml/2006/main" xmlns:w14="http://schemas.microsoft.com/office/word/2010/wordml" xmlns:w15="http://schemas.microsoft.com/office/word/2012/wordml" xmlns:w16cex="http://schemas.microsoft.com/office/word/2018/wordml/cex" xmlns:w16cid="http://schemas.microsoft.com/office/word/2016/wordml/cid" xmlns:w16="http://schemas.microsoft.com/office/word/2018/wordml" xmlns:w16sdtdh="http://schemas.microsoft.com/office/word/2020/wordml/sdtdatahash" xmlns:w16sdtfl="http://schemas.microsoft.com/office/word/2024/wordml/sdtformatlock" xmlns:w16se="http://schemas.microsoft.com/office/word/2015/wordml/symex" xmlns:w16du="http://schemas.microsoft.com/office/word/2023/wordml/word16du" xmlns:wne="http://schemas.microsoft.com/office/word/2006/wordml" mc:Ignorable="w14 w15 w16se w16cid w16 w16cex w16sdtdh w16sdtfl w16du wp14">
-  <w15:commentEx w15:paraId="51F97860" w15:done="0"/>
-  <w15:commentEx w15:paraId="55A6ECFB" w15:done="0"/>
-  <w15:commentEx w15:paraId="4FBA6D35" w15:paraIdParent="55A6ECFB" w15:done="0"/>
-</w15:commentsEx>
-</file>
-
-<file path=word/commentsExtensible.xml><?xml version="1.0" encoding="utf-8"?>
-<w16cex:commentsExtensible xmlns:wpc="http://schemas.microsoft.com/office/word/2010/wordprocessingCanvas" xmlns:cx="http://schemas.microsoft.com/office/drawing/2014/chartex" xmlns:cx1="http://schemas.microsoft.com/office/drawing/2015/9/8/chartex" xmlns:cx2="http://schemas.microsoft.com/office/drawing/2015/10/21/chartex" xmlns:cx3="http://schemas.microsoft.com/office/drawing/2016/5/9/chartex" xmlns:cx4="http://schemas.microsoft.com/office/drawing/2016/5/10/chartex" xmlns:cx5="http://schemas.microsoft.com/office/drawing/2016/5/11/chartex" xmlns:cx6="http://schemas.microsoft.com/office/drawing/2016/5/12/chartex" xmlns:cx7="http://schemas.microsoft.com/office/drawing/2016/5/13/chartex" xmlns:cx8="http://schemas.microsoft.com/office/drawing/2016/5/14/chartex" xmlns:cr="http://schemas.microsoft.com/office/comments/2020/reactions" xmlns:mc="http://schemas.openxmlformats.org/markup-compatibility/2006" xmlns:m="http://schemas.openxmlformats.org/officeDocument/2006/math" xmlns:aink="http://schemas.microsoft.com/office/drawing/2016/ink" xmlns:am3d="http://schemas.microsoft.com/office/drawing/2017/model3d" xmlns:oel="http://schemas.microsoft.com/office/2019/extlst" xmlns:r="http://schemas.openxmlformats.org/officeDocument/2006/relationships" xmlns:wp14="http://schemas.microsoft.com/office/word/2010/wordprocessingDrawing" xmlns:wp="http://schemas.openxmlformats.org/drawingml/2006/wordprocessingDrawing" xmlns:wpg="http://schemas.microsoft.com/office/word/2010/wordprocessingGroup" xmlns:wpi="http://schemas.microsoft.com/office/word/2010/wordprocessingInk" xmlns:wps="http://schemas.microsoft.com/office/word/2010/wordprocessingShape" xmlns:o="urn:schemas-microsoft-com:office:office" xmlns:v="urn:schemas-microsoft-com:vml" xmlns:w10="urn:schemas-microsoft-com:office:word" xmlns:w="http://schemas.openxmlformats.org/wordprocessingml/2006/main" xmlns:w14="http://schemas.microsoft.com/office/word/2010/wordml" xmlns:w15="http://schemas.microsoft.com/office/word/2012/wordml" xmlns:w16cex="http://schemas.microsoft.com/office/word/2018/wordml/cex" xmlns:w16cid="http://schemas.microsoft.com/office/word/2016/wordml/cid" xmlns:w16="http://schemas.microsoft.com/office/word/2018/wordml" xmlns:w16sdtdh="http://schemas.microsoft.com/office/word/2020/wordml/sdtdatahash" xmlns:w16sdtfl="http://schemas.microsoft.com/office/word/2024/wordml/sdtformatlock" xmlns:w16se="http://schemas.microsoft.com/office/word/2015/wordml/symex" xmlns:w16du="http://schemas.microsoft.com/office/word/2023/wordml/word16du" xmlns:wne="http://schemas.microsoft.com/office/word/2006/wordml" mc:Ignorable="w14 w15 w16se w16cid w16 w16cex w16sdtdh w16sdtfl cr w16du wp14">
-  <w16cex:commentExtensible w16cex:durableId="0CF9A057" w16cex:dateUtc="2025-03-31T13:25:00Z"/>
-  <w16cex:commentExtensible w16cex:durableId="5B0D66D0" w16cex:dateUtc="2025-03-31T13:25:00Z"/>
-  <w16cex:commentExtensible w16cex:durableId="0E38F10B" w16cex:dateUtc="2025-03-31T13:29:00Z"/>
-</w16cex:commentsExtensible>
-</file>
-
-<file path=word/commentsIds.xml><?xml version="1.0" encoding="utf-8"?>
-<w16cid:commentsIds xmlns:wpc="http://schemas.microsoft.com/office/word/2010/wordprocessingCanvas" xmlns:cx="http://schemas.microsoft.com/office/drawing/2014/chartex" xmlns:cx1="http://schemas.microsoft.com/office/drawing/2015/9/8/chartex" xmlns:cx2="http://schemas.microsoft.com/office/drawing/2015/10/21/chartex" xmlns:cx3="http://schemas.microsoft.com/office/drawing/2016/5/9/chartex" xmlns:cx4="http://schemas.microsoft.com/office/drawing/2016/5/10/chartex" xmlns:cx5="http://schemas.microsoft.com/office/drawing/2016/5/11/chartex" xmlns:cx6="http://schemas.microsoft.com/office/drawing/2016/5/12/chartex" xmlns:cx7="http://schemas.microsoft.com/office/drawing/2016/5/13/chartex" xmlns:cx8="http://schemas.microsoft.com/office/drawing/2016/5/14/chartex" xmlns:mc="http://schemas.openxmlformats.org/markup-compatibility/2006" xmlns:m="http://schemas.openxmlformats.org/officeDocument/2006/math" xmlns:aink="http://schemas.microsoft.com/office/drawing/2016/ink" xmlns:am3d="http://schemas.microsoft.com/office/drawing/2017/model3d" xmlns:oel="http://schemas.microsoft.com/office/2019/extlst" xmlns:r="http://schemas.openxmlformats.org/officeDocument/2006/relationships" xmlns:wp14="http://schemas.microsoft.com/office/word/2010/wordprocessingDrawing" xmlns:wp="http://schemas.openxmlformats.org/drawingml/2006/wordprocessingDrawing" xmlns:wpg="http://schemas.microsoft.com/office/word/2010/wordprocessingGroup" xmlns:wpi="http://schemas.microsoft.com/office/word/2010/wordprocessingInk" xmlns:wps="http://schemas.microsoft.com/office/word/2010/wordprocessingShape" xmlns:o="urn:schemas-microsoft-com:office:office" xmlns:v="urn:schemas-microsoft-com:vml" xmlns:w10="urn:schemas-microsoft-com:office:word" xmlns:w="http://schemas.openxmlformats.org/wordprocessingml/2006/main" xmlns:w14="http://schemas.microsoft.com/office/word/2010/wordml" xmlns:w15="http://schemas.microsoft.com/office/word/2012/wordml" xmlns:w16cex="http://schemas.microsoft.com/office/word/2018/wordml/cex" xmlns:w16cid="http://schemas.microsoft.com/office/word/2016/wordml/cid" xmlns:w16="http://schemas.microsoft.com/office/word/2018/wordml" xmlns:w16sdtdh="http://schemas.microsoft.com/office/word/2020/wordml/sdtdatahash" xmlns:w16sdtfl="http://schemas.microsoft.com/office/word/2024/wordml/sdtformatlock" xmlns:w16se="http://schemas.microsoft.com/office/word/2015/wordml/symex" xmlns:w16du="http://schemas.microsoft.com/office/word/2023/wordml/word16du" xmlns:wne="http://schemas.microsoft.com/office/word/2006/wordml" mc:Ignorable="w14 w15 w16se w16cid w16 w16cex w16sdtdh w16sdtfl w16du wp14">
-  <w16cid:commentId w16cid:paraId="51F97860" w16cid:durableId="0CF9A057"/>
-  <w16cid:commentId w16cid:paraId="55A6ECFB" w16cid:durableId="5B0D66D0"/>
-  <w16cid:commentId w16cid:paraId="4FBA6D35" w16cid:durableId="0E38F10B"/>
-</w16cid:commentsIds>
 </file>
 
 <file path=word/endnotes.xml><?xml version="1.0" encoding="utf-8"?>
@@ -19863,17 +19622,6 @@
   </w:num>
   <w:numIdMacAtCleanup w:val="4"/>
 </w:numbering>
-</file>
-
-<file path=word/people.xml><?xml version="1.0" encoding="utf-8"?>
-<w15:people xmlns:wpc="http://schemas.microsoft.com/office/word/2010/wordprocessingCanvas" xmlns:cx="http://schemas.microsoft.com/office/drawing/2014/chartex" xmlns:cx1="http://schemas.microsoft.com/office/drawing/2015/9/8/chartex" xmlns:cx2="http://schemas.microsoft.com/office/drawing/2015/10/21/chartex" xmlns:cx3="http://schemas.microsoft.com/office/drawing/2016/5/9/chartex" xmlns:cx4="http://schemas.microsoft.com/office/drawing/2016/5/10/chartex" xmlns:cx5="http://schemas.microsoft.com/office/drawing/2016/5/11/chartex" xmlns:cx6="http://schemas.microsoft.com/office/drawing/2016/5/12/chartex" xmlns:cx7="http://schemas.microsoft.com/office/drawing/2016/5/13/chartex" xmlns:cx8="http://schemas.microsoft.com/office/drawing/2016/5/14/chartex" xmlns:mc="http://schemas.openxmlformats.org/markup-compatibility/2006" xmlns:m="http://schemas.openxmlformats.org/officeDocument/2006/math" xmlns:aink="http://schemas.microsoft.com/office/drawing/2016/ink" xmlns:am3d="http://schemas.microsoft.com/office/drawing/2017/model3d" xmlns:oel="http://schemas.microsoft.com/office/2019/extlst" xmlns:r="http://schemas.openxmlformats.org/officeDocument/2006/relationships" xmlns:wp14="http://schemas.microsoft.com/office/word/2010/wordprocessingDrawing" xmlns:wp="http://schemas.openxmlformats.org/drawingml/2006/wordprocessingDrawing" xmlns:wpg="http://schemas.microsoft.com/office/word/2010/wordprocessingGroup" xmlns:wpi="http://schemas.microsoft.com/office/word/2010/wordprocessingInk" xmlns:wps="http://schemas.microsoft.com/office/word/2010/wordprocessingShape" xmlns:o="urn:schemas-microsoft-com:office:office" xmlns:v="urn:schemas-microsoft-com:vml" xmlns:w10="urn:schemas-microsoft-com:office:word" xmlns:w="http://schemas.openxmlformats.org/wordprocessingml/2006/main" xmlns:w14="http://schemas.microsoft.com/office/word/2010/wordml" xmlns:w15="http://schemas.microsoft.com/office/word/2012/wordml" xmlns:w16cex="http://schemas.microsoft.com/office/word/2018/wordml/cex" xmlns:w16cid="http://schemas.microsoft.com/office/word/2016/wordml/cid" xmlns:w16="http://schemas.microsoft.com/office/word/2018/wordml" xmlns:w16sdtdh="http://schemas.microsoft.com/office/word/2020/wordml/sdtdatahash" xmlns:w16sdtfl="http://schemas.microsoft.com/office/word/2024/wordml/sdtformatlock" xmlns:w16se="http://schemas.microsoft.com/office/word/2015/wordml/symex" xmlns:w16du="http://schemas.microsoft.com/office/word/2023/wordml/word16du" xmlns:wne="http://schemas.microsoft.com/office/word/2006/wordml" mc:Ignorable="w14 w15 w16se w16cid w16 w16cex w16sdtdh w16sdtfl w16du wp14">
-  <w15:person w15:author="James Dell">
-    <w15:presenceInfo w15:providerId="AD" w15:userId="S::James.Dell@planet-it.net::473c7a0d-619f-4459-a135-45d1413fbe4c"/>
-  </w15:person>
-  <w15:person w15:author="Barry O'Brien">
-    <w15:presenceInfo w15:providerId="AD" w15:userId="S::Barry.OBrien@planet-it.net::4455fb6e-96ee-4c3e-8b09-486224c2261d"/>
-  </w15:person>
-</w15:people>
 </file>
 
 <file path=word/styles.xml><?xml version="1.0" encoding="utf-8"?>
@@ -20862,67 +20610,6 @@
 </w:styles>
 </file>
 
-<file path=word/documenttasks/documenttasks1.xml><?xml version="1.0" encoding="utf-8"?>
-<t:Tasks xmlns:t="http://schemas.microsoft.com/office/tasks/2019/documenttasks" xmlns:oel="http://schemas.microsoft.com/office/2019/extlst">
-  <t:Task id="{453C85FF-C6DD-AE4A-8927-DB8F253AF7FE}">
-    <t:Anchor>
-      <t:Comment id="1527604944"/>
-    </t:Anchor>
-    <t:History>
-      <t:Event id="{513D3B48-F3E7-A544-978E-34874FB61D6E}" time="2025-03-31T13:25:31.785Z">
-        <t:Attribution userId="S::James.Dell@planet-it.net::473c7a0d-619f-4459-a135-45d1413fbe4c" userProvider="AD" userName="James Dell"/>
-        <t:Anchor>
-          <t:Comment id="1527604944"/>
-        </t:Anchor>
-        <t:Create/>
-      </t:Event>
-      <t:Event id="{9E2E95C7-765A-E149-91BE-1986EC3B9383}" time="2025-03-31T13:25:31.785Z">
-        <t:Attribution userId="S::James.Dell@planet-it.net::473c7a0d-619f-4459-a135-45d1413fbe4c" userProvider="AD" userName="James Dell"/>
-        <t:Anchor>
-          <t:Comment id="1527604944"/>
-        </t:Anchor>
-        <t:Assign userId="S::Barry.OBrien@planet-it.net::4455fb6e-96ee-4c3e-8b09-486224c2261d" userProvider="AD" userName="Barry O'Brien"/>
-      </t:Event>
-      <t:Event id="{8AAB52FE-CE77-8B42-B954-9A98FC849C19}" time="2025-03-31T13:25:31.785Z">
-        <t:Attribution userId="S::James.Dell@planet-it.net::473c7a0d-619f-4459-a135-45d1413fbe4c" userProvider="AD" userName="James Dell"/>
-        <t:Anchor>
-          <t:Comment id="1527604944"/>
-        </t:Anchor>
-        <t:SetTitle title="Do we want to change any of these @Barry O'Brien"/>
-      </t:Event>
-    </t:History>
-  </t:Task>
-  <t:Task id="{F947833D-949F-6741-A83F-32927F3C7D3A}">
-    <t:Anchor>
-      <t:Comment id="217686103"/>
-    </t:Anchor>
-    <t:History>
-      <t:Event id="{5BD53E9F-970C-124A-B5DF-6FECFA929D45}" time="2025-03-31T13:25:10.65Z">
-        <t:Attribution userId="S::James.Dell@planet-it.net::473c7a0d-619f-4459-a135-45d1413fbe4c" userProvider="AD" userName="James Dell"/>
-        <t:Anchor>
-          <t:Comment id="217686103"/>
-        </t:Anchor>
-        <t:Create/>
-      </t:Event>
-      <t:Event id="{EB93176B-C111-8D47-9DBB-C287150E2F1B}" time="2025-03-31T13:25:10.65Z">
-        <t:Attribution userId="S::James.Dell@planet-it.net::473c7a0d-619f-4459-a135-45d1413fbe4c" userProvider="AD" userName="James Dell"/>
-        <t:Anchor>
-          <t:Comment id="217686103"/>
-        </t:Anchor>
-        <t:Assign userId="S::Barry.OBrien@planet-it.net::4455fb6e-96ee-4c3e-8b09-486224c2261d" userProvider="AD" userName="Barry O'Brien"/>
-      </t:Event>
-      <t:Event id="{B4035531-F85B-9741-B030-96B5474C672F}" time="2025-03-31T13:25:10.65Z">
-        <t:Attribution userId="S::James.Dell@planet-it.net::473c7a0d-619f-4459-a135-45d1413fbe4c" userProvider="AD" userName="James Dell"/>
-        <t:Anchor>
-          <t:Comment id="217686103"/>
-        </t:Anchor>
-        <t:SetTitle title="@Barry O'Brien do we have one of these with updated vendor logos? "/>
-      </t:Event>
-    </t:History>
-  </t:Task>
-</t:Tasks>
-</file>
-
 <file path=word/theme/theme1.xml><?xml version="1.0" encoding="utf-8"?>
 <a:theme xmlns:a="http://schemas.openxmlformats.org/drawingml/2006/main" name="Office Theme">
   <a:themeElements>
@@ -21255,6 +20942,10 @@
 </file>
 
 <file path=customXml/item1.xml><?xml version="1.0" encoding="utf-8"?>
+<b:Sources xmlns:b="http://schemas.openxmlformats.org/officeDocument/2006/bibliography" xmlns="http://schemas.openxmlformats.org/officeDocument/2006/bibliography" SelectedStyle="\APASixthEditionOfficeOnline.xsl" StyleName="APA" Version="6"/>
+</file>
+
+<file path=customXml/item2.xml><?xml version="1.0" encoding="utf-8"?>
 <ct:contentTypeSchema xmlns:ct="http://schemas.microsoft.com/office/2006/metadata/contentType" xmlns:ma="http://schemas.microsoft.com/office/2006/metadata/properties/metaAttributes" ct:_="" ma:_="" ma:contentTypeName="Document" ma:contentTypeID="0x01010035785702D987474A98E5EB52BEDD3AA6" ma:contentTypeVersion="19" ma:contentTypeDescription="Create a new document." ma:contentTypeScope="" ma:versionID="7475e8a14b23e3b44613142ca3702c71">
   <xsd:schema xmlns:xsd="http://www.w3.org/2001/XMLSchema" xmlns:xs="http://www.w3.org/2001/XMLSchema" xmlns:p="http://schemas.microsoft.com/office/2006/metadata/properties" xmlns:ns1="http://schemas.microsoft.com/sharepoint/v3" xmlns:ns2="bc555557-3e8b-4e67-83dc-4a843c87bf48" xmlns:ns3="13e5e634-19bb-4da3-8eb1-d732f895062a" targetNamespace="http://schemas.microsoft.com/office/2006/metadata/properties" ma:root="true" ma:fieldsID="a0e591cb8f16aef1e2d445ad70521c76" ns1:_="" ns2:_="" ns3:_="">
     <xsd:import namespace="http://schemas.microsoft.com/sharepoint/v3"/>
@@ -21512,7 +21203,16 @@
 </ct:contentTypeSchema>
 </file>
 
-<file path=customXml/item2.xml><?xml version="1.0" encoding="utf-8"?>
+<file path=customXml/item3.xml><?xml version="1.0" encoding="utf-8"?>
+<?mso-contentType ?>
+<FormTemplates xmlns="http://schemas.microsoft.com/sharepoint/v3/contenttype/forms">
+  <Display>DocumentLibraryForm</Display>
+  <Edit>DocumentLibraryForm</Edit>
+  <New>DocumentLibraryForm</New>
+</FormTemplates>
+</file>
+
+<file path=customXml/item4.xml><?xml version="1.0" encoding="utf-8"?>
 <p:properties xmlns:p="http://schemas.microsoft.com/office/2006/metadata/properties" xmlns:xsi="http://www.w3.org/2001/XMLSchema-instance" xmlns:pc="http://schemas.microsoft.com/office/infopath/2007/PartnerControls">
   <documentManagement>
     <_ip_UnifiedCompliancePolicyUIAction xmlns="http://schemas.microsoft.com/sharepoint/v3" xsi:nil="true"/>
@@ -21552,20 +21252,15 @@
 </p:properties>
 </file>
 
-<file path=customXml/item3.xml><?xml version="1.0" encoding="utf-8"?>
-<?mso-contentType ?>
-<FormTemplates xmlns="http://schemas.microsoft.com/sharepoint/v3/contenttype/forms">
-  <Display>DocumentLibraryForm</Display>
-  <Edit>DocumentLibraryForm</Edit>
-  <New>DocumentLibraryForm</New>
-</FormTemplates>
+<file path=customXml/itemProps1.xml><?xml version="1.0" encoding="utf-8"?>
+<ds:datastoreItem xmlns:ds="http://schemas.openxmlformats.org/officeDocument/2006/customXml" ds:itemID="{41B34B53-803B-4600-951E-8C7B6ABDE6A5}">
+  <ds:schemaRefs>
+    <ds:schemaRef ds:uri="http://schemas.openxmlformats.org/officeDocument/2006/bibliography"/>
+  </ds:schemaRefs>
+</ds:datastoreItem>
 </file>
 
-<file path=customXml/item4.xml><?xml version="1.0" encoding="utf-8"?>
-<b:Sources xmlns:b="http://schemas.openxmlformats.org/officeDocument/2006/bibliography" xmlns="http://schemas.openxmlformats.org/officeDocument/2006/bibliography" SelectedStyle="\APASixthEditionOfficeOnline.xsl" StyleName="APA" Version="6"/>
-</file>
-
-<file path=customXml/itemProps1.xml><?xml version="1.0" encoding="utf-8"?>
+<file path=customXml/itemProps2.xml><?xml version="1.0" encoding="utf-8"?>
 <ds:datastoreItem xmlns:ds="http://schemas.openxmlformats.org/officeDocument/2006/customXml" ds:itemID="{7F9D1B01-7FEE-4553-9877-3B31209422E5}">
   <ds:schemaRefs>
     <ds:schemaRef ds:uri="http://schemas.microsoft.com/office/2006/metadata/contentType"/>
@@ -21585,7 +21280,15 @@
 </ds:datastoreItem>
 </file>
 
-<file path=customXml/itemProps2.xml><?xml version="1.0" encoding="utf-8"?>
+<file path=customXml/itemProps3.xml><?xml version="1.0" encoding="utf-8"?>
+<ds:datastoreItem xmlns:ds="http://schemas.openxmlformats.org/officeDocument/2006/customXml" ds:itemID="{02C30E68-946A-4504-B925-FF5230B8A4C3}">
+  <ds:schemaRefs>
+    <ds:schemaRef ds:uri="http://schemas.microsoft.com/sharepoint/v3/contenttype/forms"/>
+  </ds:schemaRefs>
+</ds:datastoreItem>
+</file>
+
+<file path=customXml/itemProps4.xml><?xml version="1.0" encoding="utf-8"?>
 <ds:datastoreItem xmlns:ds="http://schemas.openxmlformats.org/officeDocument/2006/customXml" ds:itemID="{EDF12601-A8A7-4B7A-9481-1111248E774A}">
   <ds:schemaRefs>
     <ds:schemaRef ds:uri="http://schemas.microsoft.com/office/2006/metadata/properties"/>
@@ -21595,20 +21298,4 @@
     <ds:schemaRef ds:uri="13e5e634-19bb-4da3-8eb1-d732f895062a"/>
   </ds:schemaRefs>
 </ds:datastoreItem>
-</file>
-
-<file path=customXml/itemProps3.xml><?xml version="1.0" encoding="utf-8"?>
-<ds:datastoreItem xmlns:ds="http://schemas.openxmlformats.org/officeDocument/2006/customXml" ds:itemID="{02C30E68-946A-4504-B925-FF5230B8A4C3}">
-  <ds:schemaRefs>
-    <ds:schemaRef ds:uri="http://schemas.microsoft.com/sharepoint/v3/contenttype/forms"/>
-  </ds:schemaRefs>
-</ds:datastoreItem>
-</file>
-
-<file path=customXml/itemProps4.xml><?xml version="1.0" encoding="utf-8"?>
-<ds:datastoreItem xmlns:ds="http://schemas.openxmlformats.org/officeDocument/2006/customXml" ds:itemID="{41B34B53-803B-4600-951E-8C7B6ABDE6A5}">
-  <ds:schemaRefs>
-    <ds:schemaRef ds:uri="http://schemas.openxmlformats.org/officeDocument/2006/bibliography"/>
-  </ds:schemaRefs>
-</ds:datastoreItem>
 </file>
</xml_diff>